<commit_message>
docs: preserve Task 7 Jenkins evidence
Co-authored-by: Copilot <223556219+Copilot@users.noreply.github.com>
</commit_message>
<xml_diff>
--- a/docs/reports/task-07-jenkins-ci.docx
+++ b/docs/reports/task-07-jenkins-ci.docx
@@ -558,7 +558,7 @@
         <w:pStyle w:val="ListBullet"/>
       </w:pPr>
       <w:r>
-        <w:t>Build Now completed successfully with BUILD SUCCESS and Finished: SUCCESS.</w:t>
+        <w:t>Build Now completes with BUILD SUCCESS and Finished: SUCCESS.</w:t>
       </w:r>
     </w:p>
     <w:p>
@@ -566,7 +566,7 @@
         <w:pStyle w:val="ListBullet"/>
       </w:pPr>
       <w:r>
-        <w:t>The parcel-tracking-portal.war file was archived.</w:t>
+        <w:t>The parcel-tracking-portal.war file is visible under the archived artifacts.</w:t>
       </w:r>
     </w:p>
     <w:p>
@@ -574,7 +574,15 @@
         <w:pStyle w:val="ListBullet"/>
       </w:pPr>
       <w:r>
-        <w:t>The job was configured to poll the develop branch for SCM changes.</w:t>
+        <w:t>An SCM-triggered build is recorded after a commit is merged into develop.</w:t>
+      </w:r>
+    </w:p>
+    <w:p>
+      <w:pPr>
+        <w:pStyle w:val="ListBullet"/>
+      </w:pPr>
+      <w:r>
+        <w:t>A deliberately failing build is captured, then the fixed commit produces a green build.</w:t>
       </w:r>
     </w:p>
     <w:p>
@@ -586,8 +594,97 @@
       </w:r>
     </w:p>
     <w:p>
+      <w:pPr>
+        <w:jc w:val="center"/>
+      </w:pPr>
       <w:r>
-        <w:t>(No screenshots found in docs/screenshots/task-07. Add images there and re-run.)</w:t>
+        <w:drawing>
+          <wp:inline xmlns:a="http://schemas.openxmlformats.org/drawingml/2006/main" xmlns:pic="http://schemas.openxmlformats.org/drawingml/2006/picture">
+            <wp:extent cx="5486400" cy="3068034"/>
+            <wp:docPr id="1" name="Picture 1"/>
+            <wp:cNvGraphicFramePr>
+              <a:graphicFrameLocks noChangeAspect="1"/>
+            </wp:cNvGraphicFramePr>
+            <a:graphic>
+              <a:graphicData uri="http://schemas.openxmlformats.org/drawingml/2006/picture">
+                <pic:pic>
+                  <pic:nvPicPr>
+                    <pic:cNvPr id="0" name="Screenshot 2026-10-12 155825.png"/>
+                    <pic:cNvPicPr/>
+                  </pic:nvPicPr>
+                  <pic:blipFill>
+                    <a:blip r:embed="rId9"/>
+                    <a:stretch>
+                      <a:fillRect/>
+                    </a:stretch>
+                  </pic:blipFill>
+                  <pic:spPr>
+                    <a:xfrm>
+                      <a:off x="0" y="0"/>
+                      <a:ext cx="5486400" cy="3068034"/>
+                    </a:xfrm>
+                    <a:prstGeom prst="rect"/>
+                  </pic:spPr>
+                </pic:pic>
+              </a:graphicData>
+            </a:graphic>
+          </wp:inline>
+        </w:drawing>
+      </w:r>
+    </w:p>
+    <w:p>
+      <w:pPr>
+        <w:jc w:val="center"/>
+      </w:pPr>
+      <w:r>
+        <w:t>Figure 1: Screenshot 2026-10-12 155825.png</w:t>
+      </w:r>
+    </w:p>
+    <w:p>
+      <w:pPr>
+        <w:jc w:val="center"/>
+      </w:pPr>
+      <w:r>
+        <w:drawing>
+          <wp:inline xmlns:a="http://schemas.openxmlformats.org/drawingml/2006/main" xmlns:pic="http://schemas.openxmlformats.org/drawingml/2006/picture">
+            <wp:extent cx="5486400" cy="3085205"/>
+            <wp:docPr id="2" name="Picture 2"/>
+            <wp:cNvGraphicFramePr>
+              <a:graphicFrameLocks noChangeAspect="1"/>
+            </wp:cNvGraphicFramePr>
+            <a:graphic>
+              <a:graphicData uri="http://schemas.openxmlformats.org/drawingml/2006/picture">
+                <pic:pic>
+                  <pic:nvPicPr>
+                    <pic:cNvPr id="0" name="Screenshot 2026-10-12 155912.png"/>
+                    <pic:cNvPicPr/>
+                  </pic:nvPicPr>
+                  <pic:blipFill>
+                    <a:blip r:embed="rId10"/>
+                    <a:stretch>
+                      <a:fillRect/>
+                    </a:stretch>
+                  </pic:blipFill>
+                  <pic:spPr>
+                    <a:xfrm>
+                      <a:off x="0" y="0"/>
+                      <a:ext cx="5486400" cy="3085205"/>
+                    </a:xfrm>
+                    <a:prstGeom prst="rect"/>
+                  </pic:spPr>
+                </pic:pic>
+              </a:graphicData>
+            </a:graphic>
+          </wp:inline>
+        </w:drawing>
+      </w:r>
+    </w:p>
+    <w:p>
+      <w:pPr>
+        <w:jc w:val="center"/>
+      </w:pPr>
+      <w:r>
+        <w:t>Figure 2: Screenshot 2026-10-12 155912.png</w:t>
       </w:r>
     </w:p>
     <w:p>
@@ -600,7 +697,12 @@
     </w:p>
     <w:p>
       <w:r>
-        <w:t>☑ Jenkins job created</w:t>
+        <w:t>☑ Jenkins security and dashboard verified</w:t>
+      </w:r>
+    </w:p>
+    <w:p>
+      <w:r>
+        <w:t>☑ Required plugins verified</w:t>
       </w:r>
     </w:p>
     <w:p>
@@ -610,12 +712,22 @@
     </w:p>
     <w:p>
       <w:r>
-        <w:t>☑ Successful Maven build verified</w:t>
+        <w:t>☑ parcel-ci-build job created</w:t>
       </w:r>
     </w:p>
     <w:p>
       <w:r>
-        <w:t>☑ WAR artifact archived</w:t>
+        <w:t>☑ Successful build and archived WAR verified</w:t>
+      </w:r>
+    </w:p>
+    <w:p>
+      <w:r>
+        <w:t>☑ SCM polling trigger demonstrated</w:t>
+      </w:r>
+    </w:p>
+    <w:p>
+      <w:r>
+        <w:t>☑ Failure and recovery evidence captured</w:t>
       </w:r>
     </w:p>
     <w:p>
@@ -633,7 +745,7 @@
     </w:p>
     <w:p>
       <w:r>
-        <w:t>The Jenkins continuous-integration job builds the develop branch with Maven and archives the generated WAR artifact.</w:t>
+        <w:t>The Jenkins continuous-integration job provides an automated Maven build for the develop branch and archives the release WAR artifact. The captured build history demonstrates both successful and failed-build recovery behavior.</w:t>
       </w:r>
     </w:p>
     <w:sectPr>

</xml_diff>